<commit_message>
Egypt and funding-shock notes: professional-reader revision (pro-reader S2)
</commit_message>
<xml_diff>
--- a/notes/emerging-market-briefing-in-days/index.docx
+++ b/notes/emerging-market-briefing-in-days/index.docx
@@ -7,7 +7,7 @@
         <w:pStyle w:val="Title"/>
       </w:pPr>
       <w:r>
-        <w:t xml:space="preserve">An emerging-market briefing in days, from a model that knows when not to trade</w:t>
+        <w:t xml:space="preserve">Who holds the debt, and in what currency: an Egypt country debrief</w:t>
       </w:r>
     </w:p>
     <w:p>
@@ -15,7 +15,7 @@
         <w:pStyle w:val="Subtitle"/>
       </w:pPr>
       <w:r>
-        <w:t xml:space="preserve">The projection model applied at short notice to Egypt, where public debt is partly in foreign currency, and then broadened to labour markets, supply capacity, fiscal policy and public debt management</w:t>
+        <w:t xml:space="preserve">The funding-regime projection framework run as a full macro-strategy debrief for an economy whose foreign-held local bills tie the currency to the flow that finances the budget</w:t>
       </w:r>
     </w:p>
     <w:p>
@@ -86,7 +86,7 @@
               <w:t xml:space="preserve"> </w:t>
             </w:r>
             <w:r>
-              <w:t xml:space="preserve">Can a framework built and tested on advanced economies brief an emerging market with foreign-currency debt at short notice, without cutting corners on the evidence?</w:t>
+              <w:t xml:space="preserve">Where does funding stress land in an economy whose government owes part of its debt in foreign currency and relies on non-resident holders of its local bills, and what follows for policy, the public finances and market positions?</w:t>
             </w:r>
           </w:p>
           <w:p>
@@ -108,7 +108,7 @@
               <w:t xml:space="preserve"> </w:t>
             </w:r>
             <w:r>
-              <w:t xml:space="preserve">The same calibrated projection model and the same evidence standard, applied to Egypt within days. The evidence chose the regime, and the briefing ran from the country’s macroeconomic position to scenarios, a watch-list and, on request, trade ideas.</w:t>
+              <w:t xml:space="preserve">The funding-regime projection framework run as a full country debrief: the regime test, the macroeconomic position, transmission from policy to market prices, scenarios with falsifiers and a watch-list.</w:t>
             </w:r>
           </w:p>
           <w:p>
@@ -130,7 +130,7 @@
               <w:t xml:space="preserve"> </w:t>
             </w:r>
             <w:r>
-              <w:t xml:space="preserve">The framework placed Egypt on the foreign-currency path and brought out the two-sided effect of high real interest rates: they support the currency and pull inflation down, and they raise the public interest bill. Both effects last only while foreign inflows continue.</w:t>
+              <w:t xml:space="preserve">The regime test put Egypt on the foreign-currency path: foreign holders of local bills make local debt behave like foreign debt for the currency. High real rates hold the pound and pull inflation down while they raise the interest bill. The currency support lasts only while inflows continue; the interest cost does not, and it rises if they stop.</w:t>
             </w:r>
           </w:p>
           <w:p>
@@ -152,7 +152,7 @@
               <w:t xml:space="preserve"> </w:t>
             </w:r>
             <w:r>
-              <w:t xml:space="preserve">Speed and rigour usually trade off. Here the speed comes from the framework itself, and the rigour comes from a standard that marks every gap in the evidence and declines to recommend anything the evidence cannot carry.</w:t>
+              <w:t xml:space="preserve">The sign of a high-real-rate policy depends on a flow that can stop. The debrief names the releases that would show it turning, with the end of the IMF programme as the clearest dated test.</w:t>
             </w:r>
           </w:p>
         </w:tc>
@@ -172,7 +172,7 @@
         <w:pStyle w:val="FirstParagraph"/>
       </w:pPr>
       <w:r>
-        <w:t xml:space="preserve">A country briefing written at short notice tends to fail in one of two ways. It is either thin, because there was no time to build a view, or confident beyond its evidence, because the gaps were filled with plausible numbers. Emerging markets make both failures more likely. The data are released with longer lags, the official and market sources disagree more often, and the price that can break is not always the one an advanced-economy reader expects to watch.</w:t>
+        <w:t xml:space="preserve">Original sin, and its local-currency form when foreign investors hold the local bonds, made the currency of the debt and its holder base the standard lens on where sovereign funding stress lands. The framework builds that lens into one calibrated quarterly projection model as an explicit switch: the debt structure decides whether a funding shock lands on the exchange rate or on long-dated government bond yields.</w:t>
       </w:r>
     </w:p>
     <w:p>
@@ -180,7 +180,7 @@
         <w:pStyle w:val="BodyText"/>
       </w:pPr>
       <w:r>
-        <w:t xml:space="preserve">The framework had been built to read advanced and emerging economies with one model, letting the currency in which public and bank debt is owed decide where a funding shock lands. Its first application covered five advanced economies, all of which borrow in their own currency. The open test was the other side of the fork: an economy whose government owes a large part of its debt in foreign currency, relies on foreign holders of its local bills, and sits close to the end of an IMF programme. Egypt fits that description, and the author last covered it in co-authored sell-side research in 2017. The question was whether the framework could carry a full briefing on it within days.</w:t>
+        <w:t xml:space="preserve">Its five-economy application ran on the local-currency side (see the note on a funding-shock projection model). Egypt runs on the other side: material external public debt, a large share of local bills held by non-residents, heavy external repayments, and the end of an IMF programme in view. The author covered Egypt in co-authored sell-side research in 2017.</w:t>
       </w:r>
     </w:p>
     <w:bookmarkEnd w:id="9"/>
@@ -208,7 +208,7 @@
         <w:t xml:space="preserve"> </w:t>
       </w:r>
       <w:r>
-        <w:t xml:space="preserve">The model does not assume that a country is an emerging market. It tests the debt structure first, in a fixed order, and the first test the evidence passes decides which block of the model applies. For Egypt the evidence pointed to the foreign-currency path: material external public debt, a large share of local bills held by non-residents, and repayments falling due within the year. On that path the objects to watch are reserve cover, external repayments and the willingness of foreign investors to keep rolling their bills, rather than the long-end auction that dominates an advanced economy’s reading.</w:t>
+        <w:t xml:space="preserve">The model tests the debt structure before it assigns a block. For Egypt the test returned the foreign-currency path: material external public debt, a large share of local bills held by non-residents, and repayments falling due within the year. On that path reserve cover, external repayments and the rollover of non-resident bills carry the risk that the long-end auction carries in an advanced economy.</w:t>
       </w:r>
     </w:p>
     <w:p>
@@ -220,95 +220,41 @@
           <w:b/>
           <w:bCs/>
         </w:rPr>
-        <w:t xml:space="preserve">One standard for every figure.</w:t>
+        <w:t xml:space="preserve">Fiscal measures traced to the curve and the currency.</w:t>
       </w:r>
       <w:r>
         <w:t xml:space="preserve"> </w:t>
       </w:r>
       <w:r>
-        <w:t xml:space="preserve">Every number in the briefing carries a grade: established from a named official source, inferred with its method stated, or not identified. Official producers come first: the central bank, the statistics office and the finance ministry, with international institutions and rating agencies as confirmation. Where two sources disagreed, both were set side by side and the one used was named. Where a series was not published for Egypt, the briefing said so and set no trigger on it.</w:t>
-      </w:r>
-    </w:p>
-    <w:p>
-      <w:pPr>
-        <w:pStyle w:val="BodyText"/>
+        <w:t xml:space="preserve">The debrief reads labour and product markets, inflation, monetary and fiscal policy, public debt management and external flows in one model. It traces a fiscal measure from announcement and legal status through financing, demand, wages and prices to the central bank, the bond curve and the currency, and back to the budget, and it stops the chain at the first link the evidence cannot support.</w:t>
+      </w:r>
+    </w:p>
+    <w:bookmarkEnd w:id="10"/>
+    <w:bookmarkStart w:id="15" w:name="what-the-work-shows"/>
+    <w:p>
+      <w:pPr>
+        <w:pStyle w:val="Heading2"/>
+      </w:pPr>
+      <w:r>
+        <w:t xml:space="preserve">What the work shows</w:t>
+      </w:r>
+    </w:p>
+    <w:p>
+      <w:pPr>
+        <w:pStyle w:val="FirstParagraph"/>
       </w:pPr>
       <w:r>
         <w:rPr>
           <w:b/>
           <w:bCs/>
         </w:rPr>
-        <w:t xml:space="preserve">Trade ideas are optional and conditional.</w:t>
+        <w:t xml:space="preserve">Where the carry reading turns.</w:t>
       </w:r>
       <w:r>
         <w:t xml:space="preserve"> </w:t>
       </w:r>
       <w:r>
-        <w:t xml:space="preserve">The same framework that writes the briefing can, on request, turn it into market positions. Each position must be tied to a mechanism in the briefing, carry an exit condition stated as an observable event, and be sized from a stated risk budget. Where the evidence for any of these is missing, the output is not a weaker trade but no trade, with the missing inputs named.</w:t>
-      </w:r>
-    </w:p>
-    <w:p>
-      <w:pPr>
-        <w:pStyle w:val="BodyText"/>
-      </w:pPr>
-      <w:r>
-        <w:rPr>
-          <w:b/>
-          <w:bCs/>
-        </w:rPr>
-        <w:t xml:space="preserve">One evidence base, several readers.</w:t>
-      </w:r>
-      <w:r>
-        <w:t xml:space="preserve"> </w:t>
-      </w:r>
-      <w:r>
-        <w:t xml:space="preserve">From the same graded evidence the framework produced a desk-style briefing, a short research abstract and plain-language explanations for readers without an economics background. The figures and their grades are identical across all three; only the register changes.</w:t>
-      </w:r>
-    </w:p>
-    <w:bookmarkEnd w:id="10"/>
-    <w:bookmarkStart w:id="19" w:name="what-the-work-shows"/>
-    <w:p>
-      <w:pPr>
-        <w:pStyle w:val="Heading2"/>
-      </w:pPr>
-      <w:r>
-        <w:t xml:space="preserve">What the work shows</w:t>
-      </w:r>
-    </w:p>
-    <w:p>
-      <w:pPr>
-        <w:pStyle w:val="FirstParagraph"/>
-      </w:pPr>
-      <w:r>
-        <w:rPr>
-          <w:b/>
-          <w:bCs/>
-        </w:rPr>
-        <w:t xml:space="preserve">The regime fork works on the other side.</w:t>
-      </w:r>
-      <w:r>
-        <w:t xml:space="preserve"> </w:t>
-      </w:r>
-      <w:r>
-        <w:t xml:space="preserve">The model that read five advanced economies on the local-currency path read Egypt on the foreign-currency path, using the same equations. The difference sits where the economics puts it: in which stock can break, and therefore in which prices and releases deserve attention.</w:t>
-      </w:r>
-    </w:p>
-    <w:p>
-      <w:pPr>
-        <w:pStyle w:val="BodyText"/>
-      </w:pPr>
-      <w:r>
-        <w:rPr>
-          <w:b/>
-          <w:bCs/>
-        </w:rPr>
-        <w:t xml:space="preserve">High real rates cut both ways.</w:t>
-      </w:r>
-      <w:r>
-        <w:t xml:space="preserve"> </w:t>
-      </w:r>
-      <w:r>
-        <w:t xml:space="preserve">The central finding of the briefing is a mechanism, not a forecast. A policy rate well above inflation draws foreign money into local bills, supports the currency, and keeps import prices, and so inflation, on a downward path. The same rate raises the share of government revenue spent on interest, which strains the fiscal credibility on which the inflows depend. While inflows continue, the first effect dominates. If they stop, the sign flips: the currency weakens, pass-through raises prices, and policy is pushed to tighten into a heavier interest bill. The first figure shows the shape of that fork on simulated data.</w:t>
+        <w:t xml:space="preserve">The familiar reading of Egypt is a carry trade financing a heavy interest bill. The debrief makes its turning point explicit. A policy rate well above inflation draws foreign money into local bills, supports the currency, and keeps import prices, and so inflation, on a downward path. The same rate raises the share of government revenue spent on interest, which strains the fiscal credibility on which the inflows depend. While inflows continue, the first effect dominates. If they stop, the sign flips: the currency weakens, pass-through raises prices, and policy is pushed to tighten into a heavier interest bill, the fiscal-dominance trap that short, foreign-held debt sets for a high-real-rate policy. The figure shows the shape of that fork on simulated data.</w:t>
       </w:r>
     </w:p>
     <w:tbl>
@@ -405,7 +351,7 @@
         <w:t xml:space="preserve"> </w:t>
       </w:r>
       <w:r>
-        <w:t xml:space="preserve">The briefing set out three scenarios, a base case, an upside and a tail, each starting from a different event and each carrying a falsifier: a named release and the level at which it would show the scenario to be wrong. The end of the IMF programme stood out as the clearest dated test of whether the inflows, and so the favourable side of the fork, would hold.</w:t>
+        <w:t xml:space="preserve">The debrief set out a base case, an upside and a tail, each starting from a different event and each carrying a falsifier: a named release and the level at which it would show the scenario to be wrong. The end of the IMF programme is the clearest dated test of whether the inflows, and so the favourable side of the fork, hold.</w:t>
       </w:r>
     </w:p>
     <w:p>
@@ -417,132 +363,17 @@
           <w:b/>
           <w:bCs/>
         </w:rPr>
-        <w:t xml:space="preserve">The gaps are part of the output.</w:t>
+        <w:t xml:space="preserve">Follow-up questions.</w:t>
       </w:r>
       <w:r>
         <w:t xml:space="preserve"> </w:t>
       </w:r>
       <w:r>
-        <w:t xml:space="preserve">A briefing that marks what it could not find is more useful than one that hides it, because the gap tells the reader where the risk of being surprised is largest. The second figure shows, on simulated data, the kind of evidence ledger the standard produces: the share of figures in each part of a briefing that are established, inferred or not identified. The later, more judgemental parts carry more inference by design, and trade ideas are issued only where their evidence conditions are met.</w:t>
-      </w:r>
-    </w:p>
-    <w:tbl>
-      <w:tblPr>
-        <w:tblStyle w:val="Table"/>
-        <w:tblW w:type="pct" w:w="5000"/>
-        <w:tblLayout w:type="fixed"/>
-        <w:tblLook w:firstRow="0" w:lastRow="0" w:firstColumn="0" w:lastColumn="0" w:noHBand="0" w:noVBand="0" w:val="0000"/>
-      </w:tblPr>
-      <w:tblGrid>
-        <w:gridCol w:w="7920"/>
-      </w:tblGrid>
-      <w:tr>
-        <w:tc>
-          <w:tcPr/>
-          <w:bookmarkStart w:id="18" w:name="fig-ledger"/>
-          <w:p>
-            <w:pPr>
-              <w:pStyle w:val="Compact"/>
-              <w:jc w:val="center"/>
-            </w:pPr>
-            <w:r>
-              <w:drawing>
-                <wp:inline>
-                  <wp:extent cx="5334000" cy="2795949"/>
-                  <wp:effectExtent b="0" l="0" r="0" t="0"/>
-                  <wp:docPr descr="" title="" id="16" name="Picture"/>
-                  <a:graphic>
-                    <a:graphicData uri="http://schemas.openxmlformats.org/drawingml/2006/picture">
-                      <pic:pic>
-                        <pic:nvPicPr>
-                          <pic:cNvPr descr="index_files/figure-docx/fig-ledger-output-1.png" id="17" name="Picture"/>
-                          <pic:cNvPicPr>
-                            <a:picLocks noChangeArrowheads="1" noChangeAspect="1"/>
-                          </pic:cNvPicPr>
-                        </pic:nvPicPr>
-                        <pic:blipFill>
-                          <a:blip r:embed="rId15"/>
-                          <a:stretch>
-                            <a:fillRect/>
-                          </a:stretch>
-                        </pic:blipFill>
-                        <pic:spPr bwMode="auto">
-                          <a:xfrm>
-                            <a:off x="0" y="0"/>
-                            <a:ext cx="5334000" cy="2795949"/>
-                          </a:xfrm>
-                          <a:prstGeom prst="rect">
-                            <a:avLst/>
-                          </a:prstGeom>
-                          <a:noFill/>
-                          <a:ln w="9525">
-                            <a:noFill/>
-                            <a:headEnd/>
-                            <a:tailEnd/>
-                          </a:ln>
-                        </pic:spPr>
-                      </pic:pic>
-                    </a:graphicData>
-                  </a:graphic>
-                </wp:inline>
-              </w:drawing>
-            </w:r>
-          </w:p>
-          <w:p>
-            <w:pPr>
-              <w:jc w:val="center"/>
-            </w:pPr>
-            <w:pPr>
-              <w:jc w:val="left"/>
-              <w:spacing w:before="200"/>
-              <w:pStyle w:val="ImageCaption"/>
-            </w:pPr>
-            <w:r>
-              <w:t xml:space="preserve">Figure 2: Evidence ledger of a country briefing: share of figures established, inferred or not identified, by part of the briefing (simulated data).</w:t>
-            </w:r>
-          </w:p>
-          <w:bookmarkEnd w:id="18"/>
-        </w:tc>
-      </w:tr>
-    </w:tbl>
-    <w:p>
-      <w:pPr>
-        <w:pStyle w:val="BodyText"/>
-      </w:pPr>
-      <w:r>
-        <w:rPr>
-          <w:b/>
-          <w:bCs/>
-        </w:rPr>
-        <w:t xml:space="preserve">The framework grew from the exercise.</w:t>
-      </w:r>
-      <w:r>
-        <w:t xml:space="preserve"> </w:t>
-      </w:r>
-      <w:r>
-        <w:t xml:space="preserve">Applying it to an emerging market under time pressure showed where it was thin, and the specification was then broadened to cover labour markets, supply capacity, aggregate demand, fiscal policy and public debt management in one integrated reading. Fiscal decisions are now traced step by step, from announcement and legal status through financing, demand, wages and prices, to the central bank, the bond curve and the currency, and back to the budget, with the chain stopping at the first link the evidence cannot support.</w:t>
-      </w:r>
-    </w:p>
-    <w:p>
-      <w:pPr>
-        <w:pStyle w:val="BodyText"/>
-      </w:pPr>
-      <w:r>
-        <w:rPr>
-          <w:b/>
-          <w:bCs/>
-        </w:rPr>
-        <w:t xml:space="preserve">Follow-up questions run on the same standard.</w:t>
-      </w:r>
-      <w:r>
-        <w:t xml:space="preserve"> </w:t>
-      </w:r>
-      <w:r>
-        <w:t xml:space="preserve">The framework then answered three narrower questions on the same country: whether it can keep servicing its foreign debt, how the politics of official financing enter that answer as its IMF programme ends, and whether a disruption to imported food changes it. Each answer was traced back into the same loop between real rates, foreign inflows and the interest bill, and each stopped where the evidence stopped. The foreign debt is manageable on its present path only while maturing obligations keep being rolled over and the currency holds. Politics matters through the official inflows that keep that rollover going and through the anchor that the programme’s end removes. The food shock tightens the loop at the margin without becoming the trigger.</w:t>
-      </w:r>
-    </w:p>
-    <w:bookmarkEnd w:id="19"/>
-    <w:bookmarkStart w:id="20" w:name="insights"/>
+        <w:t xml:space="preserve">Three narrower questions ran on the same country: external-debt sustainability, the politics of official financing as the IMF programme ends, and a disruption to imported food. Each traced back into the same loop between real rates, foreign inflows and the interest bill. Politics enters through the official inflows that keep the rollover going and through the anchor that the programme’s end removes. The food shock tightens the loop at the margin without becoming the trigger.</w:t>
+      </w:r>
+    </w:p>
+    <w:bookmarkEnd w:id="15"/>
+    <w:bookmarkStart w:id="16" w:name="insights"/>
     <w:p>
       <w:pPr>
         <w:pStyle w:val="Heading2"/>
@@ -564,13 +395,13 @@
           <w:b/>
           <w:bCs/>
         </w:rPr>
-        <w:t xml:space="preserve">Speed comes from the framework, not from shortcuts.</w:t>
+        <w:t xml:space="preserve">The holder matters as much as the currency.</w:t>
       </w:r>
       <w:r>
         <w:t xml:space="preserve"> </w:t>
       </w:r>
       <w:r>
-        <w:t xml:space="preserve">A model that already knows which questions decide a country’s risk turns days of preparation into a briefing that can be read and challenged line by line.</w:t>
+        <w:t xml:space="preserve">Local bills held by foreign investors tie the currency to the same flow that finances the budget, so the regime test reads who holds the debt as well as its denomination.</w:t>
       </w:r>
     </w:p>
     <w:p>
@@ -608,83 +439,17 @@
           <w:b/>
           <w:bCs/>
         </w:rPr>
-        <w:t xml:space="preserve">Knowing when not to trade is a feature.</w:t>
+        <w:t xml:space="preserve">A shock that tightens is not a shock that breaks.</w:t>
       </w:r>
       <w:r>
         <w:t xml:space="preserve"> </w:t>
       </w:r>
       <w:r>
-        <w:t xml:space="preserve">A recommendation that cannot name its exit, its size and its evidence is withheld, with the missing inputs listed. That discipline is what makes the recommendations that are issued worth reading.</w:t>
-      </w:r>
-    </w:p>
-    <w:p>
-      <w:pPr>
-        <w:pStyle w:val="Compact"/>
-        <w:numPr>
-          <w:ilvl w:val="0"/>
-          <w:numId w:val="1002"/>
-        </w:numPr>
-      </w:pPr>
-      <w:r>
-        <w:rPr>
-          <w:b/>
-          <w:bCs/>
-        </w:rPr>
-        <w:t xml:space="preserve">A marked gap is information.</w:t>
-      </w:r>
-      <w:r>
-        <w:t xml:space="preserve"> </w:t>
-      </w:r>
-      <w:r>
-        <w:t xml:space="preserve">The places where the evidence is not identified are where the next release can surprise most, and the briefing says so instead of filling them.</w:t>
-      </w:r>
-    </w:p>
-    <w:p>
-      <w:pPr>
-        <w:pStyle w:val="Compact"/>
-        <w:numPr>
-          <w:ilvl w:val="0"/>
-          <w:numId w:val="1002"/>
-        </w:numPr>
-      </w:pPr>
-      <w:r>
-        <w:rPr>
-          <w:b/>
-          <w:bCs/>
-        </w:rPr>
-        <w:t xml:space="preserve">One evidence base can serve every reader.</w:t>
-      </w:r>
-      <w:r>
-        <w:t xml:space="preserve"> </w:t>
-      </w:r>
-      <w:r>
-        <w:t xml:space="preserve">Graded evidence can be written up for a trading desk, a policy reader or a non-specialist without the numbers changing between versions.</w:t>
-      </w:r>
-    </w:p>
-    <w:p>
-      <w:pPr>
-        <w:pStyle w:val="Compact"/>
-        <w:numPr>
-          <w:ilvl w:val="0"/>
-          <w:numId w:val="1002"/>
-        </w:numPr>
-      </w:pPr>
-      <w:r>
-        <w:rPr>
-          <w:b/>
-          <w:bCs/>
-        </w:rPr>
-        <w:t xml:space="preserve">A shock that tightens is not a shock that breaks.</w:t>
-      </w:r>
-      <w:r>
-        <w:t xml:space="preserve"> </w:t>
-      </w:r>
-      <w:r>
         <w:t xml:space="preserve">A dearer import bill can keep interest rates higher for longer and the public interest bill heavier, but the path flips only if financing stops. Keeping the two apart stops a briefing from reading every new headline as a crisis.</w:t>
       </w:r>
     </w:p>
-    <w:bookmarkEnd w:id="20"/>
-    <w:bookmarkStart w:id="21" w:name="scope-and-next-steps"/>
+    <w:bookmarkEnd w:id="16"/>
+    <w:bookmarkStart w:id="17" w:name="scope-and-next-steps"/>
     <w:p>
       <w:pPr>
         <w:pStyle w:val="Heading2"/>
@@ -698,7 +463,7 @@
         <w:pStyle w:val="FirstParagraph"/>
       </w:pPr>
       <w:r>
-        <w:t xml:space="preserve">The framework reads an emerging market with foreign-currency debt and an advanced economy with local-currency debt on one calibrated model, and can deliver a graded country briefing at short notice, with market positions available on request and withheld where the evidence is short.</w:t>
+        <w:t xml:space="preserve">The framework reads an emerging market on the foreign-currency path and advanced economies on the local-currency path with one calibrated model, and delivers a country debrief with scenarios, falsifiers and, on request, market positions.</w:t>
       </w:r>
     </w:p>
     <w:p>
@@ -706,7 +471,7 @@
         <w:pStyle w:val="BodyText"/>
       </w:pPr>
       <w:r>
-        <w:t xml:space="preserve">The natural extensions are three. First, the broadened specification, with its labour, supply and fiscal blocks, applied across the Middle East and North Africa and to hybrid cases where both debt blocks run at once. Second, the briefing tracked through time, so that each scenario’s falsifier is checked against the release that tests it. Third, a policy version of the output, in which the fiscal transmission map is read for its implications for official lending, programme design and spillovers to the UK.</w:t>
+        <w:t xml:space="preserve">The natural extensions are three. First, the debrief’s figures set out at their official sources: the gross external financing need against reserves and committed official inflows, and non-resident bill holdings against the interest bill. Second, the specification applied across the Middle East and North Africa and to hybrid cases where both debt blocks run at once. Third, a policy version of the output, in which the fiscal transmission map is read for its implications for official lending, programme design and spillovers to the UK.</w:t>
       </w:r>
     </w:p>
     <w:p>
@@ -717,8 +482,8 @@
         <w:t xml:space="preserve">The full specification, the country briefing and its plain-language versions can be discussed on request.</w:t>
       </w:r>
     </w:p>
-    <w:bookmarkEnd w:id="21"/>
-    <w:bookmarkStart w:id="22" w:name="about-the-evidence"/>
+    <w:bookmarkEnd w:id="17"/>
+    <w:bookmarkStart w:id="18" w:name="about-the-evidence"/>
     <w:p>
       <w:pPr>
         <w:pStyle w:val="Heading2"/>
@@ -732,7 +497,7 @@
         <w:pStyle w:val="FirstParagraph"/>
       </w:pPr>
       <w:r>
-        <w:t xml:space="preserve">The work was done in October 2026. It rests on the written model specification, a full country briefing on Egypt with its scenarios, watch-list and trade ideas, a short research abstract, a plain-language explanation for non-specialists, the broadened specification written after the exercise, and three follow-up assessments (external-debt sustainability, the politics of official financing, and a supply shock to imported food), two of them with plain-language versions. The coefficients are calibration priors, not estimates. The market and fiscal figures behind the briefing are not reproduced here. The two figures are simulated, built to share the structure of the analysis (a two-path fork for foreign inflows, an evidence ledger by part of the briefing); neither shows a real estimate.</w:t>
+        <w:t xml:space="preserve">The work was done in October 2026. It rests on the written model specification, a full country briefing on Egypt with its scenarios, watch-list and trade ideas, a short research abstract, plain-language explanations for non-specialists, and three follow-up assessments (external-debt sustainability, the politics of official financing, and a supply shock to imported food). Every figure in the briefing is graded as established from a named official source, inferred with its method stated, or not identified, and conflicting sources are shown side by side. The coefficients are calibration priors, not estimates. The market and fiscal figures behind the briefing are not reproduced here. The figure is simulated, built to share the structure of the analysis (a two-path fork for foreign inflows); it shows no real estimate.</w:t>
       </w:r>
     </w:p>
     <w:p>
@@ -759,7 +524,7 @@
         <w:t xml:space="preserve">are generated from simulated data built to share the structure of the analysis (its variables, horizons and frequencies). They show how each method works and what its output looks like. Results stated in the text, and figures that give a source, are the project’s own. Methods are described at the level of a methods section. Code and data pipelines are not reproduced here.</w:t>
       </w:r>
     </w:p>
-    <w:bookmarkEnd w:id="22"/>
+    <w:bookmarkEnd w:id="18"/>
     <w:sectPr>
       <w:footnotePr>
         <w:numRestart w:val="eachSect"/>

</xml_diff>